<commit_message>
Creación de readme (Resumen de proyecto, equipo de trabajo, objetivo, arquitectura, tecnologias, instalación proyecto) y actualizacion de objetivos especifiicos de encargo 1
</commit_message>
<xml_diff>
--- a/Gestión/EV. 1 PetDate Encargo.docx
+++ b/Gestión/EV. 1 PetDate Encargo.docx
@@ -541,12 +541,12 @@
           <wp:inline distB="114300" distT="114300" distL="114300" distR="114300">
             <wp:extent cx="5316375" cy="4189590"/>
             <wp:effectExtent b="0" l="0" r="0" t="0"/>
-            <wp:docPr id="2" name="image1.jpg"/>
+            <wp:docPr id="2" name="image2.jpg"/>
             <a:graphic>
               <a:graphicData uri="http://schemas.openxmlformats.org/drawingml/2006/picture">
                 <pic:pic>
                   <pic:nvPicPr>
-                    <pic:cNvPr id="0" name="image1.jpg"/>
+                    <pic:cNvPr id="0" name="image2.jpg"/>
                     <pic:cNvPicPr preferRelativeResize="0"/>
                   </pic:nvPicPr>
                   <pic:blipFill>
@@ -912,7 +912,7 @@
           <w:rFonts w:ascii="Cambria" w:cs="Cambria" w:eastAsia="Cambria" w:hAnsi="Cambria"/>
           <w:rtl w:val="0"/>
         </w:rPr>
-        <w:t xml:space="preserve">“Implementar funciones que permitan el registro, almacenamiento, datos médicos y datos de relevancia de mascotas en una única plataforma”</w:t>
+        <w:t xml:space="preserve">“Desarrollar un sistema de registro y almacenamiento de información de mascotas, incluyendo datos médicos y antecedentes relevantes.”</w:t>
       </w:r>
     </w:p>
     <w:p>
@@ -931,7 +931,26 @@
           <w:rFonts w:ascii="Cambria" w:cs="Cambria" w:eastAsia="Cambria" w:hAnsi="Cambria"/>
           <w:rtl w:val="0"/>
         </w:rPr>
-        <w:t xml:space="preserve">“Mejorar y facilitar, la busqueda y gestion de servicios relacionados con el cuidado y bienestar de las mascotas, tales como veterinarias, tiendas y peluquerías”</w:t>
+        <w:t xml:space="preserve">“Implementar un módulo de búsqueda y visualización de servicios relacionados con mascotas, tales como veterinarias, tiendas y peluquerías.”</w:t>
+      </w:r>
+    </w:p>
+    <w:p>
+      <w:pPr>
+        <w:numPr>
+          <w:ilvl w:val="0"/>
+          <w:numId w:val="1"/>
+        </w:numPr>
+        <w:ind w:left="720" w:hanging="360"/>
+        <w:rPr>
+          <w:rFonts w:ascii="Cambria" w:cs="Cambria" w:eastAsia="Cambria" w:hAnsi="Cambria"/>
+        </w:rPr>
+      </w:pPr>
+      <w:r>
+        <w:rPr>
+          <w:rFonts w:ascii="Cambria" w:cs="Cambria" w:eastAsia="Cambria" w:hAnsi="Cambria"/>
+          <w:rtl w:val="0"/>
+        </w:rPr>
+        <w:t xml:space="preserve">“Diseñar una interfaz web que permita gestionar información de mascotas y acceder a servicios desde una única plataforma.”</w:t>
       </w:r>
     </w:p>
     <w:p>
@@ -1332,12 +1351,12 @@
           <wp:inline distB="114300" distT="114300" distL="114300" distR="114300">
             <wp:extent cx="5731200" cy="3314700"/>
             <wp:effectExtent b="0" l="0" r="0" t="0"/>
-            <wp:docPr id="1" name="image2.png"/>
+            <wp:docPr id="1" name="image1.png"/>
             <a:graphic>
               <a:graphicData uri="http://schemas.openxmlformats.org/drawingml/2006/picture">
                 <pic:pic>
                   <pic:nvPicPr>
-                    <pic:cNvPr id="0" name="image2.png"/>
+                    <pic:cNvPr id="0" name="image1.png"/>
                     <pic:cNvPicPr preferRelativeResize="0"/>
                   </pic:nvPicPr>
                   <pic:blipFill>

</xml_diff>